<commit_message>
Correct Dealum statuses and submission dates in Base44 report
</commit_message>
<xml_diff>
--- a/reports/ZEROPAY_BASE44_PROGRESS_REPORT_DRAFT_2026-10-07.docx
+++ b/reports/ZEROPAY_BASE44_PROGRESS_REPORT_DRAFT_2026-10-07.docx
@@ -167,7 +167,7 @@
           <w:b w:val="0"/>
           <w:sz w:val="32"/>
         </w:rPr>
-        <w:t>Status below is taken from our own tracker. Nothing is stated as won that has not been won.</w:t>
+        <w:t>Status below is taken from our own tracker and from the programme portals. Nothing is stated as won that has not been won. Two of the applications (Estonia and Lithuania) show as Archived on Dealum, and we say so plainly below.</w:t>
       </w:r>
     </w:p>
     <w:tbl>
@@ -253,7 +253,7 @@
               <w:rPr>
                 <w:sz w:val="28"/>
               </w:rPr>
-              <w:t>Submitted 24 Aug 2026</w:t>
+              <w:t>Submitted 24 Aug 2026 (code FEBO-HSYX-9443)</w:t>
             </w:r>
           </w:p>
         </w:tc>
@@ -267,7 +267,7 @@
               <w:rPr>
                 <w:sz w:val="28"/>
               </w:rPr>
-              <w:t>Decision pending. Committee review is normally about 10 working days, so we are chasing the status.</w:t>
+              <w:t>Shown as Archived by the deal room on Dealum, with no message or decision received. Archived can mean a decline or another administrative reason, so the outcome is unconfirmed. A written status request was sent on 7 Oct 2026 through Dealum and by email.</w:t>
             </w:r>
           </w:p>
         </w:tc>
@@ -297,7 +297,7 @@
               <w:rPr>
                 <w:sz w:val="28"/>
               </w:rPr>
-              <w:t>Submitted 5 Oct 2026</w:t>
+              <w:t>Submitted 26 Aug 2026 (code AJEB-VNXQ-9439)</w:t>
             </w:r>
           </w:p>
         </w:tc>
@@ -311,7 +311,7 @@
               <w:rPr>
                 <w:sz w:val="28"/>
               </w:rPr>
-              <w:t>Decision pending.</w:t>
+              <w:t>The programme invited us to a video interview on 23 Sep 2026. We did not see the invitation in time because it sat inside the Dealum portal and no email alert reached us, so the interview was missed and the application is now Archived. A request to reopen the application and reschedule was sent on 7 Oct 2026 through Dealum and by email. Outcome unconfirmed.</w:t>
             </w:r>
           </w:p>
         </w:tc>
@@ -771,7 +771,7 @@
           <w:b/>
           <w:sz w:val="32"/>
         </w:rPr>
-        <w:t>We want to be straightforward: FID was declined today. We are not counting it, and we have removed it from our expectations. No grant has been approved yet. The pipeline is real and broad, but it is a pipeline, not revenue.</w:t>
+        <w:t>We want to be straightforward: FID was declined today. We are not counting it, and we have removed it from our expectations. No grant has been approved yet. Estonia and Lithuania are archived on Dealum and we are asking both programmes directly for the outcome. The pipeline is real and broad, but it is a pipeline, not revenue.</w:t>
       </w:r>
     </w:p>
     <w:p>
@@ -848,7 +848,7 @@
         <w:rPr>
           <w:sz w:val="32"/>
         </w:rPr>
-        <w:t>Phase 1 (Oct to Dec 2026): UK company incorporated; EU and Innovate UK applications filed; follow-up on Estonia, Lithuania, Station F and other pending decisions.</w:t>
+        <w:t>Phase 1 (Oct to Dec 2026): UK company incorporated; EU and Innovate UK applications filed; replies from Estonia and Lithuania to our 7 Oct requests; follow-up on Station F and other pending decisions.</w:t>
       </w:r>
     </w:p>
     <w:p>
@@ -1028,6 +1028,17 @@
           <w:sz w:val="32"/>
         </w:rPr>
         <w:t>No grant has been approved yet and none is guaranteed.</w:t>
+      </w:r>
+    </w:p>
+    <w:p>
+      <w:pPr>
+        <w:pStyle w:val="ListBullet"/>
+      </w:pPr>
+      <w:r>
+        <w:rPr>
+          <w:sz w:val="32"/>
+        </w:rPr>
+        <w:t>The Estonia and Lithuania Startup Visa applications are both Archived on Dealum. We missed the Lithuania interview of 23 Sep because the invitation sat inside the portal with no email alert, and we have asked both programmes for the outcome.</w:t>
       </w:r>
     </w:p>
     <w:p>
@@ -1228,7 +1239,37 @@
               <w:rPr>
                 <w:sz w:val="28"/>
               </w:rPr>
-              <w:t>Estonia, Lithuania, Station F decisions</w:t>
+              <w:t>Replies from Estonia and Lithuania to our 7 Oct requests (reopen or status)</w:t>
+            </w:r>
+          </w:p>
+        </w:tc>
+        <w:tc>
+          <w:tcPr>
+            <w:tcW w:type="dxa" w:w="4320"/>
+          </w:tcPr>
+          <w:p>
+            <w:r/>
+            <w:r>
+              <w:rPr>
+                <w:sz w:val="28"/>
+              </w:rPr>
+              <w:t>Checked daily; we will report each</w:t>
+            </w:r>
+          </w:p>
+        </w:tc>
+      </w:tr>
+      <w:tr>
+        <w:tc>
+          <w:tcPr>
+            <w:tcW w:type="dxa" w:w="4320"/>
+          </w:tcPr>
+          <w:p>
+            <w:r/>
+            <w:r>
+              <w:rPr>
+                <w:sz w:val="28"/>
+              </w:rPr>
+              <w:t>Station F and other pending decisions</w:t>
             </w:r>
           </w:p>
         </w:tc>

</xml_diff>

<commit_message>
Report: neutral wording on Estonia and Lithuania status
</commit_message>
<xml_diff>
--- a/reports/ZEROPAY_BASE44_PROGRESS_REPORT_DRAFT_2026-10-07.docx
+++ b/reports/ZEROPAY_BASE44_PROGRESS_REPORT_DRAFT_2026-10-07.docx
@@ -167,7 +167,7 @@
           <w:b w:val="0"/>
           <w:sz w:val="32"/>
         </w:rPr>
-        <w:t>Status below is taken from our own tracker and from the programme portals. Nothing is stated as won that has not been won. Two of the applications (Estonia and Lithuania) show as Archived on Dealum, and we say so plainly below.</w:t>
+        <w:t>Status below is taken from our own tracker and from the programme portals. Nothing is stated as won that has not been won.</w:t>
       </w:r>
     </w:p>
     <w:tbl>
@@ -253,7 +253,7 @@
               <w:rPr>
                 <w:sz w:val="28"/>
               </w:rPr>
-              <w:t>Submitted 24 Aug 2026 (code FEBO-HSYX-9443)</w:t>
+              <w:t>Submitted 24 Aug 2026</w:t>
             </w:r>
           </w:p>
         </w:tc>
@@ -267,7 +267,7 @@
               <w:rPr>
                 <w:sz w:val="28"/>
               </w:rPr>
-              <w:t>Shown as Archived by the deal room on Dealum, with no message or decision received. Archived can mean a decline or another administrative reason, so the outcome is unconfirmed. A written status request was sent on 7 Oct 2026 through Dealum and by email.</w:t>
+              <w:t>In correspondence with the programme about the status of the application. A status request was sent on 7 Oct 2026 and acknowledged the same day, with a reply promised within 5 to 10 working days.</w:t>
             </w:r>
           </w:p>
         </w:tc>
@@ -297,7 +297,7 @@
               <w:rPr>
                 <w:sz w:val="28"/>
               </w:rPr>
-              <w:t>Submitted 26 Aug 2026 (code AJEB-VNXQ-9439)</w:t>
+              <w:t>Submitted 26 Aug 2026</w:t>
             </w:r>
           </w:p>
         </w:tc>
@@ -311,7 +311,7 @@
               <w:rPr>
                 <w:sz w:val="28"/>
               </w:rPr>
-              <w:t>The programme invited us to a video interview on 23 Sep 2026. We did not see the invitation in time because it sat inside the Dealum portal and no email alert reached us, so the interview was missed and the application is now Archived. A request to reopen the application and reschedule was sent on 7 Oct 2026 through Dealum and by email. Outcome unconfirmed.</w:t>
+              <w:t>In correspondence with the programme about the status of the application and next steps. A request was sent on 7 Oct 2026. Awaiting their reply.</w:t>
             </w:r>
           </w:p>
         </w:tc>
@@ -771,7 +771,7 @@
           <w:b/>
           <w:sz w:val="32"/>
         </w:rPr>
-        <w:t>We want to be straightforward: FID was declined today. We are not counting it, and we have removed it from our expectations. No grant has been approved yet. Estonia and Lithuania are archived on Dealum and we are asking both programmes directly for the outcome. The pipeline is real and broad, but it is a pipeline, not revenue.</w:t>
+        <w:t>We want to be straightforward: FID was declined today. We are not counting it, and we have removed it from our expectations. No grant has been approved yet. We are in correspondence with the Estonia and Lithuania programmes about the status of our earlier applications. The pipeline is real and broad, but it is a pipeline, not revenue.</w:t>
       </w:r>
     </w:p>
     <w:p>
@@ -1038,7 +1038,7 @@
         <w:rPr>
           <w:sz w:val="32"/>
         </w:rPr>
-        <w:t>The Estonia and Lithuania Startup Visa applications are both Archived on Dealum. We missed the Lithuania interview of 23 Sep because the invitation sat inside the portal with no email alert, and we have asked both programmes for the outcome.</w:t>
+        <w:t>The outcome of the Estonia and Lithuania Startup Visa applications is not yet confirmed. We are in correspondence with both programmes about the status of those earlier applications.</w:t>
       </w:r>
     </w:p>
     <w:p>
@@ -1239,7 +1239,7 @@
               <w:rPr>
                 <w:sz w:val="28"/>
               </w:rPr>
-              <w:t>Replies from Estonia and Lithuania to our 7 Oct requests (reopen or status)</w:t>
+              <w:t>Replies from Estonia and Lithuania on the status of our earlier applications</w:t>
             </w:r>
           </w:p>
         </w:tc>

</xml_diff>